<commit_message>
Expand complete plan with day-one main session
</commit_message>
<xml_diff>
--- a/水网认知智能产品发布会实施方案_完整版.docx
+++ b/水网认知智能产品发布会实施方案_完整版.docx
@@ -145,6 +145,362 @@
       </w:pPr>
       <w:r>
         <w:t>为会后签约、试用、联合实验室与课程共建提供明确推进清单</w:t>
+      </w:r>
+    </w:p>
+    <w:p/>
+    <w:p>
+      <w:r>
+        <w:t>两天整体安排总览：</w:t>
+      </w:r>
+    </w:p>
+    <w:p>
+      <w:pPr>
+        <w:pStyle w:val="ListBullet"/>
+      </w:pPr>
+      <w:r>
+        <w:t>4 月 25 日下午主场定位为“产品发布主会场”，重点完成主题立势、产品矩阵发布、案例演示、应用见证、生态启动。</w:t>
+      </w:r>
+    </w:p>
+    <w:p>
+      <w:pPr>
+        <w:pStyle w:val="ListBullet"/>
+      </w:pPr>
+      <w:r>
+        <w:t>4 月 26 日上午专场定位为“企业与高校应用报告专场”，重点完成应用承接、单位发声、人才培养共建、合作转化。</w:t>
+      </w:r>
+    </w:p>
+    <w:p>
+      <w:pPr>
+        <w:pStyle w:val="ListBullet"/>
+      </w:pPr>
+      <w:r>
+        <w:t>两天内容前后衔接，形成“首发发布 + 次日承接”的完整链路。</w:t>
+      </w:r>
+    </w:p>
+    <w:p/>
+    <w:p>
+      <w:r>
+        <w:rPr>
+          <w:rFonts w:ascii="SimHei" w:hAnsi="SimHei" w:eastAsia="SimHei"/>
+          <w:b/>
+          <w:sz w:val="32"/>
+        </w:rPr>
+        <w:t>两天总体方案结构</w:t>
+      </w:r>
+    </w:p>
+    <w:p/>
+    <w:p>
+      <w:r>
+        <w:rPr>
+          <w:rFonts w:ascii="SimHei" w:hAnsi="SimHei" w:eastAsia="SimHei"/>
+          <w:b/>
+          <w:sz w:val="28"/>
+        </w:rPr>
+        <w:t>第一天：4 月 25 日下午产品发布主会场</w:t>
+      </w:r>
+    </w:p>
+    <w:p/>
+    <w:p>
+      <w:r>
+        <w:t>**时间：** 2026 年 4 月 25 日 14:00—17:50</w:t>
+      </w:r>
+    </w:p>
+    <w:p>
+      <w:r>
+        <w:t>**定位：** 产品发布、品牌立势、工程验证、生态启动</w:t>
+      </w:r>
+    </w:p>
+    <w:p>
+      <w:r>
+        <w:t>**核心目标：**</w:t>
+      </w:r>
+    </w:p>
+    <w:p/>
+    <w:p>
+      <w:pPr>
+        <w:pStyle w:val="ListNumber"/>
+      </w:pPr>
+      <w:r>
+        <w:t>正式发布六大核心产品与 HydroClaw 相关产品体系。</w:t>
+      </w:r>
+    </w:p>
+    <w:p>
+      <w:pPr>
+        <w:pStyle w:val="ListNumber"/>
+      </w:pPr>
+      <w:r>
+        <w:t>用真实案例、真实演示、真实见证证明产品具备工程应用能力。</w:t>
+      </w:r>
+    </w:p>
+    <w:p>
+      <w:pPr>
+        <w:pStyle w:val="ListNumber"/>
+      </w:pPr>
+      <w:r>
+        <w:t>通过概念片、启动仪式、发布口号、首批共建单位亮相形成传播记忆点。</w:t>
+      </w:r>
+    </w:p>
+    <w:p>
+      <w:pPr>
+        <w:pStyle w:val="ListNumber"/>
+      </w:pPr>
+      <w:r>
+        <w:t>为第二天企业与高校专场做预热和承接。</w:t>
+      </w:r>
+    </w:p>
+    <w:p/>
+    <w:p>
+      <w:r>
+        <w:t>**25 日下午主会场建议总议程：**</w:t>
+      </w:r>
+    </w:p>
+    <w:p/>
+    <w:p>
+      <w:r>
+        <w:t>| 时间 | 环节 | 主要内容 | 目标 |</w:t>
+      </w:r>
+    </w:p>
+    <w:p>
+      <w:r>
+        <w:t>|------|------|----------|------|</w:t>
+      </w:r>
+    </w:p>
+    <w:p>
+      <w:r>
+        <w:t>| 13:30—14:00 | 暖场签到 | 签到、暖场片、主视觉循环播放 | 建立发布氛围 |</w:t>
+      </w:r>
+    </w:p>
+    <w:p>
+      <w:r>
+        <w:t>| 14:00—14:08 | 开场环节 | 倒计时 + 3 分钟概念片 + 主持开场 | 快速立势 |</w:t>
+      </w:r>
+    </w:p>
+    <w:p>
+      <w:r>
+        <w:t>| 14:08—14:20 | 致辞环节 | 领导/主办方代表致辞 | 建立高度与权威性 |</w:t>
+      </w:r>
+    </w:p>
+    <w:p>
+      <w:r>
+        <w:t>| 14:20—14:50 | 产品体系发布 | 六大产品矩阵总览发布 | 完成核心发布动作 |</w:t>
+      </w:r>
+    </w:p>
+    <w:p>
+      <w:r>
+        <w:t>| 14:50—15:20 | 重点产品演示 | HydroClaw 桌面端、Web 端、手机端三端联动演示 | 建立“可用、好用”认知 |</w:t>
+      </w:r>
+    </w:p>
+    <w:p>
+      <w:r>
+        <w:t>| 15:20—15:45 | 典型案例发布 | 双容水箱、大渡河、中线/东线/胶东等案例展示 | 证明真实落地能力 |</w:t>
+      </w:r>
+    </w:p>
+    <w:p>
+      <w:r>
+        <w:t>| 15:45—16:00 | 茶歇互动 | 体验区开放、扫码提问与投票 | 收集合作线索 |</w:t>
+      </w:r>
+    </w:p>
+    <w:p>
+      <w:r>
+        <w:t>| 16:00—16:25 | 应用见证环节 | 业主、合作方、应用单位代表发言 | 形成第三方背书 |</w:t>
+      </w:r>
+    </w:p>
+    <w:p>
+      <w:r>
+        <w:t>| 16:25—16:50 | 验证与装备展示 | SIL/HIL 在环测试、硬件仿真机、实物装备展示 | 强化工程可信度 |</w:t>
+      </w:r>
+    </w:p>
+    <w:p>
+      <w:r>
+        <w:t>| 16:50—17:15 | 生态启动环节 | 首批共建单位亮相、倡议发布、授牌/点亮仪式 | 完成生态启动 |</w:t>
+      </w:r>
+    </w:p>
+    <w:p>
+      <w:r>
+        <w:t>| 17:15—17:35 | 媒体互动与合作邀约 | 主持收束、合作入口说明、媒体拍摄 | 推动传播与转化 |</w:t>
+      </w:r>
+    </w:p>
+    <w:p>
+      <w:r>
+        <w:t>| 17:35—17:50 | 合影与自由交流 | 嘉宾合影、体验区深度交流 | 为次日专场承接 |</w:t>
+      </w:r>
+    </w:p>
+    <w:p/>
+    <w:p>
+      <w:r>
+        <w:t>**25 日下午主会场建议重点内容摘录：**</w:t>
+      </w:r>
+    </w:p>
+    <w:p/>
+    <w:p>
+      <w:pPr>
+        <w:pStyle w:val="ListBullet"/>
+      </w:pPr>
+      <w:r>
+        <w:t>开场以黑场、倒计时、概念片迅速建立“正式发布”身份，而不是普通学术论坛。</w:t>
+      </w:r>
+    </w:p>
+    <w:p>
+      <w:pPr>
+        <w:pStyle w:val="ListBullet"/>
+      </w:pPr>
+      <w:r>
+        <w:t>产品体系发布环节按照“连续揭晓”方式推进，让六大产品逐一亮相并形成记忆点。</w:t>
+      </w:r>
+    </w:p>
+    <w:p>
+      <w:pPr>
+        <w:pStyle w:val="ListBullet"/>
+      </w:pPr>
+      <w:r>
+        <w:t>HydroClaw 建议采用桌面端、Web 端、手机端三端同屏演示，突出多角色协同。</w:t>
+      </w:r>
+    </w:p>
+    <w:p>
+      <w:pPr>
+        <w:pStyle w:val="ListBullet"/>
+      </w:pPr>
+      <w:r>
+        <w:t>案例环节优先选取双容水箱、大渡河、南水北调中线/东线、胶东调水等真实场景。</w:t>
+      </w:r>
+    </w:p>
+    <w:p>
+      <w:pPr>
+        <w:pStyle w:val="ListBullet"/>
+      </w:pPr>
+      <w:r>
+        <w:t>应用见证环节邀请业主、合作方、应用单位代表短发言，补齐发布会第三方证明。</w:t>
+      </w:r>
+    </w:p>
+    <w:p>
+      <w:pPr>
+        <w:pStyle w:val="ListBullet"/>
+      </w:pPr>
+      <w:r>
+        <w:t>生态启动环节建议公布首批共建高校、合作单位、测试基地、开发者社区名单。</w:t>
+      </w:r>
+    </w:p>
+    <w:p/>
+    <w:p>
+      <w:r>
+        <w:t>**25 日下午建议输出成果：**</w:t>
+      </w:r>
+    </w:p>
+    <w:p/>
+    <w:p>
+      <w:pPr>
+        <w:pStyle w:val="ListBullet"/>
+      </w:pPr>
+      <w:r>
+        <w:t>3 分钟开场概念片</w:t>
+      </w:r>
+    </w:p>
+    <w:p>
+      <w:pPr>
+        <w:pStyle w:val="ListBullet"/>
+      </w:pPr>
+      <w:r>
+        <w:t>30 秒倒计时短视频</w:t>
+      </w:r>
+    </w:p>
+    <w:p>
+      <w:pPr>
+        <w:pStyle w:val="ListBullet"/>
+      </w:pPr>
+      <w:r>
+        <w:t>产品矩阵首发内容</w:t>
+      </w:r>
+    </w:p>
+    <w:p>
+      <w:pPr>
+        <w:pStyle w:val="ListBullet"/>
+      </w:pPr>
+      <w:r>
+        <w:t>三端联动演示视频或录屏</w:t>
+      </w:r>
+    </w:p>
+    <w:p>
+      <w:pPr>
+        <w:pStyle w:val="ListBullet"/>
+      </w:pPr>
+      <w:r>
+        <w:t>应用见证发言素材</w:t>
+      </w:r>
+    </w:p>
+    <w:p>
+      <w:pPr>
+        <w:pStyle w:val="ListBullet"/>
+      </w:pPr>
+      <w:r>
+        <w:t>启动仪式照片与短视频</w:t>
+      </w:r>
+    </w:p>
+    <w:p>
+      <w:pPr>
+        <w:pStyle w:val="ListBullet"/>
+      </w:pPr>
+      <w:r>
+        <w:t>当日高光快剪、新闻稿、媒体传播素材</w:t>
+      </w:r>
+    </w:p>
+    <w:p/>
+    <w:p>
+      <w:r>
+        <w:rPr>
+          <w:rFonts w:ascii="SimHei" w:hAnsi="SimHei" w:eastAsia="SimHei"/>
+          <w:b/>
+          <w:sz w:val="28"/>
+        </w:rPr>
+        <w:t>第二天：4 月 26 日上午企业与高校应用报告专场</w:t>
+      </w:r>
+    </w:p>
+    <w:p/>
+    <w:p>
+      <w:r>
+        <w:t>**时间：** 2026 年 4 月 26 日 09:00—12:00</w:t>
+      </w:r>
+    </w:p>
+    <w:p>
+      <w:r>
+        <w:t>**定位：** 应用承接、合作转化、课程共建、共同体启动</w:t>
+      </w:r>
+    </w:p>
+    <w:p>
+      <w:r>
+        <w:t>**核心目标：**</w:t>
+      </w:r>
+    </w:p>
+    <w:p/>
+    <w:p>
+      <w:pPr>
+        <w:pStyle w:val="ListNumber"/>
+      </w:pPr>
+      <w:r>
+        <w:t>由企业代表说明真实工程需求与应用场景。</w:t>
+      </w:r>
+    </w:p>
+    <w:p>
+      <w:pPr>
+        <w:pStyle w:val="ListNumber"/>
+      </w:pPr>
+      <w:r>
+        <w:t>由高校和科研院所代表说明课程体系、人才培养与联合实验室需求。</w:t>
+      </w:r>
+    </w:p>
+    <w:p>
+      <w:pPr>
+        <w:pStyle w:val="ListNumber"/>
+      </w:pPr>
+      <w:r>
+        <w:t>把 25 日下午的“发布动作”转为 26 日上午的“合作动作”。</w:t>
+      </w:r>
+    </w:p>
+    <w:p>
+      <w:pPr>
+        <w:pStyle w:val="ListNumber"/>
+      </w:pPr>
+      <w:r>
+        <w:t>完成“水网认知智能产学研共同体”启动与首批共建单位亮相。</w:t>
       </w:r>
     </w:p>
     <w:p/>

</xml_diff>